<commit_message>
Add Apache-2.0 LICENSE/NOTICE, rebrand to EpisodeSleuth, settings unsaved-changes guard + persistent model-download progress
- LICENSE: full Apache License 2.0 (Copyright 2026 bartonjd)
- NOTICE: attribution + third-party component licenses
- Rebrand user-facing refs to EpisodeSleuth across build_msix.ps1, install.ps1/.bat, AppxManifest.xml, setup.py, pyproject.toml, GUI title, README/INSTALL/USAGE docs (Python package name audio_fingerprint kept)
- setup.py: name=episode-sleuth, Apache-2.0 license/classifier, episodesleuth* console scripts (dvd-* aliases kept)
- README: Contributing (fork+PR, protected main / push access) and License (Apache-2.0 rationale) sections
- Settings: unsaved-changes Save/Discard/Cancel guard on tab leave; persistent Vosk model download progress bar with Cancel Download; cancel on leave; Save disabled during download
</commit_message>
<xml_diff>
--- a/INSTALL_WINDOWS.docx
+++ b/INSTALL_WINDOWS.docx
@@ -2,13 +2,13 @@
 <file path=word/document.xml><?xml version="1.0" encoding="utf-8"?>
 <w:document xmlns:w="http://schemas.openxmlformats.org/wordprocessingml/2006/main" xmlns:m="http://schemas.openxmlformats.org/officeDocument/2006/math" xmlns:r="http://schemas.openxmlformats.org/officeDocument/2006/relationships" xmlns:o="urn:schemas-microsoft-com:office:office" xmlns:v="urn:schemas-microsoft-com:vml" xmlns:w10="urn:schemas-microsoft-com:office:word" xmlns:a="http://schemas.openxmlformats.org/drawingml/2006/main" xmlns:pic="http://schemas.openxmlformats.org/drawingml/2006/picture" xmlns:wp="http://schemas.openxmlformats.org/drawingml/2006/wordprocessingDrawing">
   <w:body>
-    <w:bookmarkStart w:id="34" w:name="X0786291bc046ba63ef486064f7412db17dd4473"/>
+    <w:bookmarkStart w:id="34" w:name="installing-episodesleuth-on-windows"/>
     <w:p>
       <w:pPr>
         <w:pStyle w:val="Heading1"/>
       </w:pPr>
       <w:r>
-        <w:t xml:space="preserve">Installing the DVD Episode Identifier on Windows</w:t>
+        <w:t xml:space="preserve">Installing EpisodeSleuth on Windows</w:t>
       </w:r>
     </w:p>
     <w:p>
@@ -16,19 +16,35 @@
         <w:pStyle w:val="FirstParagraph"/>
       </w:pPr>
       <w:r>
-        <w:t xml:space="preserve">This guide walks you through setting up everything the phonetic dialogue</w:t>
-      </w:r>
-      <w:r>
-        <w:t xml:space="preserve"> </w:t>
-      </w:r>
-      <w:r>
-        <w:t xml:space="preserve">fingerprinting system needs on a Windows machine. No programming experience</w:t>
-      </w:r>
-      <w:r>
-        <w:t xml:space="preserve"> </w:t>
-      </w:r>
-      <w:r>
-        <w:t xml:space="preserve">required.</w:t>
+        <w:t xml:space="preserve">This guide walks you through setting up everything</w:t>
+      </w:r>
+      <w:r>
+        <w:t xml:space="preserve"> </w:t>
+      </w:r>
+      <w:r>
+        <w:rPr>
+          <w:bCs/>
+          <w:b/>
+        </w:rPr>
+        <w:t xml:space="preserve">EpisodeSleuth</w:t>
+      </w:r>
+      <w:r>
+        <w:t xml:space="preserve"> </w:t>
+      </w:r>
+      <w:r>
+        <w:t xml:space="preserve">(the</w:t>
+      </w:r>
+      <w:r>
+        <w:t xml:space="preserve"> </w:t>
+      </w:r>
+      <w:r>
+        <w:t xml:space="preserve">phonetic dialogue fingerprinting system) needs on a Windows machine. No</w:t>
+      </w:r>
+      <w:r>
+        <w:t xml:space="preserve"> </w:t>
+      </w:r>
+      <w:r>
+        <w:t xml:space="preserve">programming experience required.</w:t>
       </w:r>
     </w:p>
     <w:p>
@@ -492,7 +508,7 @@
         <w:t xml:space="preserve">“</w:t>
       </w:r>
       <w:r>
-        <w:t xml:space="preserve">DVD Episode Identifier</w:t>
+        <w:t xml:space="preserve">EpisodeSleuth</w:t>
       </w:r>
       <w:r>
         <w:t xml:space="preserve">”</w:t>
@@ -1150,7 +1166,23 @@
         <w:t xml:space="preserve"> </w:t>
       </w:r>
       <w:r>
-        <w:t xml:space="preserve">double-click</w:t>
+        <w:t xml:space="preserve">double-click the</w:t>
+      </w:r>
+      <w:r>
+        <w:t xml:space="preserve"> </w:t>
+      </w:r>
+      <w:r>
+        <w:rPr>
+          <w:bCs/>
+          <w:b/>
+        </w:rPr>
+        <w:t xml:space="preserve">EpisodeSleuth</w:t>
+      </w:r>
+      <w:r>
+        <w:t xml:space="preserve"> </w:t>
+      </w:r>
+      <w:r>
+        <w:t xml:space="preserve">shortcut (or</w:t>
       </w:r>
       <w:r>
         <w:t xml:space="preserve"> </w:t>
@@ -1162,7 +1194,13 @@
         <w:t xml:space="preserve">fluent_launcher.bat</w:t>
       </w:r>
       <w:r>
-        <w:t xml:space="preserve">, or run</w:t>
+        <w:t xml:space="preserve">),</w:t>
+      </w:r>
+      <w:r>
+        <w:t xml:space="preserve"> </w:t>
+      </w:r>
+      <w:r>
+        <w:t xml:space="preserve">or run</w:t>
       </w:r>
       <w:r>
         <w:t xml:space="preserve"> </w:t>
@@ -1196,7 +1234,7 @@
         <w:rPr>
           <w:rStyle w:val="VerbatimChar"/>
         </w:rPr>
-        <w:t xml:space="preserve">python identify_dvd_episodes.py --dir "C:\path\to\dvd_rips"</w:t>
+        <w:t xml:space="preserve">python -m audio_fingerprint.cli.identify --dir "C:\path\to\dvd_rips"</w:t>
       </w:r>
     </w:p>
     <w:p>

</xml_diff>

<commit_message>
Add cross-platform standalone executable build (PyInstaller)
- episodesleuth.spec: one shared cross-platform PyInstaller spec (entry gui/__main__.py,
  pathex root+parent for mixed bare/package imports, bundles config.json + app.ico,
  collect-all vosk/qfluentwidgets, excludes heavy unused libs -> ~400MB vs 1.7GB)
  with BUNDLE_MODEL and ONEFILE env switches
- build_exe.ps1 / build_exe.sh: wrapper scripts (throwaway .buildvenv) for Windows and Linux/macOS
- BUILD_EXECUTABLES.md: documents exe build, options, and relationship to MSIX/source installs
- README + INSTALL_WINDOWS: standalone-executable sections (cleaner launch, no fluent_launcher.bat)
- .gitignore: track hand-authored episodesleuth.spec; add renamed launcher
- Verified: build succeeds on Linux and the produced executable launches headless

MSIX (build_msix.ps1) retained as the Store/signed-installer path.
</commit_message>
<xml_diff>
--- a/INSTALL_WINDOWS.docx
+++ b/INSTALL_WINDOWS.docx
@@ -2,7 +2,7 @@
 <file path=word/document.xml><?xml version="1.0" encoding="utf-8"?>
 <w:document xmlns:w="http://schemas.openxmlformats.org/wordprocessingml/2006/main" xmlns:m="http://schemas.openxmlformats.org/officeDocument/2006/math" xmlns:r="http://schemas.openxmlformats.org/officeDocument/2006/relationships" xmlns:o="urn:schemas-microsoft-com:office:office" xmlns:v="urn:schemas-microsoft-com:vml" xmlns:w10="urn:schemas-microsoft-com:office:word" xmlns:a="http://schemas.openxmlformats.org/drawingml/2006/main" xmlns:pic="http://schemas.openxmlformats.org/drawingml/2006/picture" xmlns:wp="http://schemas.openxmlformats.org/drawingml/2006/wordprocessingDrawing">
   <w:body>
-    <w:bookmarkStart w:id="34" w:name="installing-episodesleuth-on-windows"/>
+    <w:bookmarkStart w:id="35" w:name="installing-episodesleuth-on-windows"/>
     <w:p>
       <w:pPr>
         <w:pStyle w:val="Heading1"/>
@@ -90,6 +90,80 @@
       </w:r>
       <w:r>
         <w:t xml:space="preserve">case you prefer to do it yourself.</w:t>
+      </w:r>
+    </w:p>
+    <w:p>
+      <w:pPr>
+        <w:pStyle w:val="BlockText"/>
+      </w:pPr>
+      <w:r>
+        <w:rPr>
+          <w:bCs/>
+          <w:b/>
+        </w:rPr>
+        <w:t xml:space="preserve">Just want a runnable app with no Python at all?</w:t>
+      </w:r>
+      <w:r>
+        <w:t xml:space="preserve"> </w:t>
+      </w:r>
+      <w:r>
+        <w:t xml:space="preserve">Build (or obtain) a</w:t>
+      </w:r>
+      <w:r>
+        <w:t xml:space="preserve"> </w:t>
+      </w:r>
+      <w:r>
+        <w:t xml:space="preserve">standalone executable instead - see</w:t>
+      </w:r>
+      <w:r>
+        <w:t xml:space="preserve"> </w:t>
+      </w:r>
+      <w:hyperlink r:id="rId20">
+        <w:r>
+          <w:rPr>
+            <w:rStyle w:val="Hyperlink"/>
+          </w:rPr>
+          <w:t xml:space="preserve">BUILD_EXECUTABLES.md</w:t>
+        </w:r>
+      </w:hyperlink>
+      <w:r>
+        <w:t xml:space="preserve">. You get a</w:t>
+      </w:r>
+      <w:r>
+        <w:t xml:space="preserve"> </w:t>
+      </w:r>
+      <w:r>
+        <w:rPr>
+          <w:rStyle w:val="VerbatimChar"/>
+        </w:rPr>
+        <w:t xml:space="preserve">dist\EpisodeSleuth\EpisodeSleuth.exe</w:t>
+      </w:r>
+      <w:r>
+        <w:t xml:space="preserve"> </w:t>
+      </w:r>
+      <w:r>
+        <w:t xml:space="preserve">you can double-click; only</w:t>
+      </w:r>
+      <w:r>
+        <w:t xml:space="preserve"> </w:t>
+      </w:r>
+      <w:r>
+        <w:rPr>
+          <w:rStyle w:val="VerbatimChar"/>
+        </w:rPr>
+        <w:t xml:space="preserve">ffmpeg</w:t>
+      </w:r>
+      <w:r>
+        <w:t xml:space="preserve"> </w:t>
+      </w:r>
+      <w:r>
+        <w:t xml:space="preserve">is</w:t>
+      </w:r>
+      <w:r>
+        <w:t xml:space="preserve"> </w:t>
+      </w:r>
+      <w:r>
+        <w:t xml:space="preserve">still needed at run time.</w:t>
       </w:r>
     </w:p>
     <w:p>
@@ -99,7 +173,7 @@
         </w:pict>
       </w:r>
     </w:p>
-    <w:bookmarkStart w:id="22" w:name="what-you-need"/>
+    <w:bookmarkStart w:id="23" w:name="what-you-need"/>
     <w:p>
       <w:pPr>
         <w:pStyle w:val="Heading2"/>
@@ -211,7 +285,7 @@
             <w:r>
               <w:t xml:space="preserve"> </w:t>
             </w:r>
-            <w:hyperlink r:id="rId20">
+            <w:hyperlink r:id="rId21">
               <w:r>
                 <w:rPr>
                   <w:rStyle w:val="Hyperlink"/>
@@ -273,7 +347,7 @@
             <w:r>
               <w:t xml:space="preserve"> </w:t>
             </w:r>
-            <w:hyperlink r:id="rId21">
+            <w:hyperlink r:id="rId22">
               <w:r>
                 <w:rPr>
                   <w:rStyle w:val="Hyperlink"/>
@@ -388,8 +462,8 @@
         </w:pict>
       </w:r>
     </w:p>
-    <w:bookmarkEnd w:id="22"/>
-    <w:bookmarkStart w:id="23" w:name="option-a-automatic-recommended"/>
+    <w:bookmarkEnd w:id="23"/>
+    <w:bookmarkStart w:id="24" w:name="option-a-automatic-recommended"/>
     <w:p>
       <w:pPr>
         <w:pStyle w:val="Heading2"/>
@@ -764,8 +838,8 @@
         </w:pict>
       </w:r>
     </w:p>
-    <w:bookmarkEnd w:id="23"/>
-    <w:bookmarkStart w:id="29" w:name="option-b-manual-step-by-step"/>
+    <w:bookmarkEnd w:id="24"/>
+    <w:bookmarkStart w:id="30" w:name="option-b-manual-step-by-step"/>
     <w:p>
       <w:pPr>
         <w:pStyle w:val="Heading2"/>
@@ -774,7 +848,7 @@
         <w:t xml:space="preserve">Option B: Manual step-by-step</w:t>
       </w:r>
     </w:p>
-    <w:bookmarkStart w:id="24" w:name="install-python-3"/>
+    <w:bookmarkStart w:id="25" w:name="install-python-3"/>
     <w:p>
       <w:pPr>
         <w:pStyle w:val="Heading3"/>
@@ -793,7 +867,7 @@
       <w:r>
         <w:t xml:space="preserve"> </w:t>
       </w:r>
-      <w:hyperlink r:id="rId20">
+      <w:hyperlink r:id="rId21">
         <w:r>
           <w:rPr>
             <w:rStyle w:val="Hyperlink"/>
@@ -862,8 +936,8 @@
         <w:t xml:space="preserve">python --version</w:t>
       </w:r>
     </w:p>
-    <w:bookmarkEnd w:id="24"/>
-    <w:bookmarkStart w:id="25" w:name="install-ffmpeg"/>
+    <w:bookmarkEnd w:id="25"/>
+    <w:bookmarkStart w:id="26" w:name="install-ffmpeg"/>
     <w:p>
       <w:pPr>
         <w:pStyle w:val="Heading3"/>
@@ -907,7 +981,7 @@
       <w:r>
         <w:t xml:space="preserve"> </w:t>
       </w:r>
-      <w:hyperlink r:id="rId21">
+      <w:hyperlink r:id="rId22">
         <w:r>
           <w:rPr>
             <w:rStyle w:val="Hyperlink"/>
@@ -959,8 +1033,8 @@
         <w:t xml:space="preserve">ffmpeg -version</w:t>
       </w:r>
     </w:p>
-    <w:bookmarkEnd w:id="25"/>
-    <w:bookmarkStart w:id="26" w:name="install-python-packages"/>
+    <w:bookmarkEnd w:id="26"/>
+    <w:bookmarkStart w:id="27" w:name="install-python-packages"/>
     <w:p>
       <w:pPr>
         <w:pStyle w:val="Heading3"/>
@@ -1002,8 +1076,8 @@
         <w:t xml:space="preserve">Double Metaphone (phonetic encoding), and other dependencies.</w:t>
       </w:r>
     </w:p>
-    <w:bookmarkEnd w:id="26"/>
-    <w:bookmarkStart w:id="28" w:name="download-the-vosk-speech-model"/>
+    <w:bookmarkEnd w:id="27"/>
+    <w:bookmarkStart w:id="29" w:name="download-the-vosk-speech-model"/>
     <w:p>
       <w:pPr>
         <w:pStyle w:val="Heading3"/>
@@ -1039,7 +1113,7 @@
       <w:r>
         <w:t xml:space="preserve"> </w:t>
       </w:r>
-      <w:hyperlink r:id="rId27">
+      <w:hyperlink r:id="rId28">
         <w:r>
           <w:rPr>
             <w:rStyle w:val="Hyperlink"/>
@@ -1136,9 +1210,9 @@
         </w:pict>
       </w:r>
     </w:p>
-    <w:bookmarkEnd w:id="28"/>
     <w:bookmarkEnd w:id="29"/>
-    <w:bookmarkStart w:id="32" w:name="running-the-app"/>
+    <w:bookmarkEnd w:id="30"/>
+    <w:bookmarkStart w:id="33" w:name="running-the-app"/>
     <w:p>
       <w:pPr>
         <w:pStyle w:val="Heading2"/>
@@ -1247,7 +1321,7 @@
       <w:r>
         <w:t xml:space="preserve"> </w:t>
       </w:r>
-      <w:hyperlink r:id="rId30">
+      <w:hyperlink r:id="rId31">
         <w:r>
           <w:rPr>
             <w:rStyle w:val="Hyperlink"/>
@@ -1264,7 +1338,7 @@
       <w:r>
         <w:t xml:space="preserve"> </w:t>
       </w:r>
-      <w:hyperlink r:id="rId31">
+      <w:hyperlink r:id="rId32">
         <w:r>
           <w:rPr>
             <w:rStyle w:val="Hyperlink"/>
@@ -1286,8 +1360,8 @@
         </w:pict>
       </w:r>
     </w:p>
-    <w:bookmarkEnd w:id="32"/>
-    <w:bookmarkStart w:id="33" w:name="troubleshooting"/>
+    <w:bookmarkEnd w:id="33"/>
+    <w:bookmarkStart w:id="34" w:name="troubleshooting"/>
     <w:p>
       <w:pPr>
         <w:pStyle w:val="Heading2"/>
@@ -1521,8 +1595,8 @@
         </w:tc>
       </w:tr>
     </w:tbl>
-    <w:bookmarkEnd w:id="33"/>
     <w:bookmarkEnd w:id="34"/>
+    <w:bookmarkEnd w:id="35"/>
     <w:sectPr/>
   </w:body>
 </w:document>

</xml_diff>